<commit_message>
docs: add IEEE project report docx
</commit_message>
<xml_diff>
--- a/Project_Report_IEEE.docx
+++ b/Project_Report_IEEE.docx
@@ -196,7 +196,15 @@
         <w:spacing w:after="120"/>
       </w:pPr>
       <w:r>
-        <w:t xml:space="preserve">AURUM uses a hybrid parser (Regex combined with Claude AI) to break down these sentences and routes the rules to five separate "specialist agents"—one each for RSI, EMA, SMA, MACD, and Bollinger Bands. An Orchestrator then reviews their feedback, checks for logical conflicts (like buying when momentum is crashing), and gives the strategy a final score out of 100. At the same time, a high-speed </w:t>
+        <w:t xml:space="preserve">AURUM uses a hybrid parser (Regex combined with Claude AI) to break down these sentences and routes the rules to five separate "specialist </w:t>
+      </w:r>
+      <w:proofErr w:type="spellStart"/>
+      <w:r>
+        <w:t>agents"one</w:t>
+      </w:r>
+      <w:proofErr w:type="spellEnd"/>
+      <w:r>
+        <w:t xml:space="preserve"> each for RSI, EMA, SMA, MACD, and Bollinger Bands. An Orchestrator then reviews their feedback, checks for logical conflicts (like buying when momentum is crashing), and gives the strategy a final score out of 100. At the same time, a high-speed </w:t>
       </w:r>
       <w:proofErr w:type="spellStart"/>
       <w:r>
@@ -472,7 +480,13 @@
         <w:t>AURUM</w:t>
       </w:r>
       <w:r>
-        <w:t xml:space="preserve"> — an AI-powered, modular multi-agent framework in which each technical indicator is represented by an autonomous Specialist Agent. The system architecture follows the Multi-Agent System (MAS) paradigm [4], wherein agents operate independently on their respective indicator domains, communicate </w:t>
+        <w:t xml:space="preserve"> </w:t>
+      </w:r>
+      <w:r>
+        <w:t xml:space="preserve">- </w:t>
+      </w:r>
+      <w:r>
+        <w:t xml:space="preserve">an AI-powered, modular multi-agent framework in which each technical indicator is represented by an autonomous Specialist Agent. The system architecture follows the Multi-Agent System (MAS) paradigm [4], wherein agents operate independently on their respective indicator domains, communicate </w:t>
       </w:r>
       <w:r>
         <w:lastRenderedPageBreak/>
@@ -484,7 +498,19 @@
       </w:r>
       <w:proofErr w:type="spellEnd"/>
       <w:r>
-        <w:t>. The Orchestrator performs weighted score aggregation, inter-agent conflict detection, and verdict generation. The complete pipeline — from natural language input to interactive dashboard output — executes within seconds, enabling rapid iterative strategy refinement.</w:t>
+        <w:t xml:space="preserve">. The Orchestrator performs weighted score aggregation, inter-agent conflict detection, and verdict generation. The complete pipeline </w:t>
+      </w:r>
+      <w:r>
+        <w:t xml:space="preserve">- </w:t>
+      </w:r>
+      <w:r>
+        <w:t xml:space="preserve">from natural language input to interactive dashboard output </w:t>
+      </w:r>
+      <w:r>
+        <w:t xml:space="preserve">- </w:t>
+      </w:r>
+      <w:r>
+        <w:t>executes within seconds, enabling rapid iterative strategy refinement.</w:t>
       </w:r>
     </w:p>
     <w:p>
@@ -711,7 +737,19 @@
         <w:spacing w:after="120"/>
       </w:pPr>
       <w:r>
-        <w:t>Gold exhibits distinctive market microstructure characteristics — it functions simultaneously as a commodity, a currency, and a safe-haven asset — that influence the reliability of different technical indicators:</w:t>
+        <w:t xml:space="preserve">Gold exhibits distinctive market microstructure characteristics </w:t>
+      </w:r>
+      <w:r>
+        <w:t xml:space="preserve">- </w:t>
+      </w:r>
+      <w:r>
+        <w:t xml:space="preserve">it functions simultaneously as a commodity, a currency, and a safe-haven asset </w:t>
+      </w:r>
+      <w:r>
+        <w:t xml:space="preserve">- </w:t>
+      </w:r>
+      <w:r>
+        <w:t>that influence the reliability of different technical indicators:</w:t>
       </w:r>
     </w:p>
     <w:p>
@@ -4396,7 +4434,19 @@
       </w:r>
       <w:proofErr w:type="spellEnd"/>
       <w:r>
-        <w:t xml:space="preserve"> — whether from regex or LLM — passes through the </w:t>
+        <w:t xml:space="preserve"> </w:t>
+      </w:r>
+      <w:r>
+        <w:t xml:space="preserve">- </w:t>
+      </w:r>
+      <w:r>
+        <w:t xml:space="preserve">whether from regex or LLM </w:t>
+      </w:r>
+      <w:r>
+        <w:t xml:space="preserve">- </w:t>
+      </w:r>
+      <w:r>
+        <w:t xml:space="preserve">passes through the </w:t>
       </w:r>
       <w:proofErr w:type="spellStart"/>
       <w:r>
@@ -5203,7 +5253,19 @@
         <w:t>Crossover Conditions:</w:t>
       </w:r>
       <w:r>
-        <w:t xml:space="preserve"> Compares fast EMA (e.g., EMA20) against slow EMA (e.g., EMA50). The agent recognises canonical combinations — (9,21) for scalping, (20,50) for short-medium crossovers, and (50,200) for the Golden/Death Cross — and assigns base scores reflecting their empirical reliability on Gold.</w:t>
+        <w:t xml:space="preserve"> Compares fast EMA (e.g., EMA20) against slow EMA (e.g., EMA50). The agent recognises canonical combinations </w:t>
+      </w:r>
+      <w:r>
+        <w:t xml:space="preserve">- </w:t>
+      </w:r>
+      <w:r>
+        <w:t xml:space="preserve">(9,21) for scalping, (20,50) for short-medium crossovers, and (50,200) for the Golden/Death Cross </w:t>
+      </w:r>
+      <w:r>
+        <w:t xml:space="preserve">- </w:t>
+      </w:r>
+      <w:r>
+        <w:t>and assigns base scores reflecting their empirical reliability on Gold.</w:t>
       </w:r>
     </w:p>
     <w:p>
@@ -6389,7 +6451,13 @@
         <w:spacing w:after="120"/>
       </w:pPr>
       <w:r>
-        <w:t>Suggestions from all agents and conflict warnings are collected, deduplicated, and priority-ordered — conflict-derived suggestions appear first, followed by agent-level recommendations. This produces an actionable checklist for the trader.</w:t>
+        <w:t xml:space="preserve">Suggestions from all agents and conflict warnings are collected, deduplicated, and priority-ordered </w:t>
+      </w:r>
+      <w:r>
+        <w:t xml:space="preserve">- </w:t>
+      </w:r>
+      <w:r>
+        <w:t>conflict-derived suggestions appear first, followed by agent-level recommendations. This produces an actionable checklist for the trader.</w:t>
       </w:r>
     </w:p>
     <w:p>
@@ -6928,7 +6996,21 @@
       </w:r>
       <w:r>
         <w:lastRenderedPageBreak/>
-        <w:t>are permitted — the index advances past the hold period before scanning for the next signal. Per-trade return is computed as:</w:t>
+        <w:t xml:space="preserve">are </w:t>
+      </w:r>
+      <w:proofErr w:type="gramStart"/>
+      <w:r>
+        <w:t xml:space="preserve">permitted </w:t>
+      </w:r>
+      <w:r>
+        <w:t xml:space="preserve"> -</w:t>
+      </w:r>
+      <w:proofErr w:type="gramEnd"/>
+      <w:r>
+        <w:t xml:space="preserve"> </w:t>
+      </w:r>
+      <w:r>
+        <w:t>the index advances past the hold period before scanning for the next signal. Per-trade return is computed as:</w:t>
       </w:r>
     </w:p>
     <w:p>
@@ -8060,7 +8142,21 @@
           <w:b/>
           <w:bCs/>
         </w:rPr>
-        <w:t>Test Case 1 — Golden Cross (SMA 50/200):</w:t>
+        <w:t>Test Case 1</w:t>
+      </w:r>
+      <w:r>
+        <w:rPr>
+          <w:b/>
+          <w:bCs/>
+        </w:rPr>
+        <w:t xml:space="preserve">: </w:t>
+      </w:r>
+      <w:r>
+        <w:rPr>
+          <w:b/>
+          <w:bCs/>
+        </w:rPr>
+        <w:t>Golden Cross (SMA 50/200):</w:t>
       </w:r>
       <w:r>
         <w:br/>
@@ -8084,7 +8180,21 @@
           <w:b/>
           <w:bCs/>
         </w:rPr>
-        <w:t>Test Case 2 — Multi-Indicator Confluence:</w:t>
+        <w:t>Test Case 2</w:t>
+      </w:r>
+      <w:r>
+        <w:rPr>
+          <w:b/>
+          <w:bCs/>
+        </w:rPr>
+        <w:t xml:space="preserve">: </w:t>
+      </w:r>
+      <w:r>
+        <w:rPr>
+          <w:b/>
+          <w:bCs/>
+        </w:rPr>
+        <w:t>Multi-Indicator Confluence:</w:t>
       </w:r>
       <w:r>
         <w:br/>
@@ -8117,7 +8227,21 @@
           <w:b/>
           <w:bCs/>
         </w:rPr>
-        <w:t>Test Case 3 — Buying Overbought:</w:t>
+        <w:t>Test Case 3</w:t>
+      </w:r>
+      <w:r>
+        <w:rPr>
+          <w:b/>
+          <w:bCs/>
+        </w:rPr>
+        <w:t xml:space="preserve">: </w:t>
+      </w:r>
+      <w:r>
+        <w:rPr>
+          <w:b/>
+          <w:bCs/>
+        </w:rPr>
+        <w:t>Buying Overbought:</w:t>
       </w:r>
       <w:r>
         <w:br/>
@@ -8158,11 +8282,25 @@
           <w:b/>
           <w:bCs/>
         </w:rPr>
-        <w:t>Test Case 4 — RSI Oversold + MACD Bearish:</w:t>
+        <w:t>Test Case 4</w:t>
+      </w:r>
+      <w:r>
+        <w:rPr>
+          <w:b/>
+          <w:bCs/>
+        </w:rPr>
+        <w:t xml:space="preserve">: </w:t>
+      </w:r>
+      <w:r>
+        <w:rPr>
+          <w:b/>
+          <w:bCs/>
+        </w:rPr>
+        <w:t>RSI Oversold + MACD Bearish:</w:t>
       </w:r>
       <w:r>
         <w:br/>
-        <w:t>When tested with "Buy when RSI below 30 and MACD bearish crossover", the parser correctly generated two conditions — RSI (BUY-direction) and MACD (SELL-direction due to bearish crossover). The Orchestrator detected an action-alignment mismatch (HIGH severity) between the RSI Agent (BUY alignment due to oversold conditions) and the MACD Agent (SELL alignment due to bearish momentum), issued a descriptive warning explaining the contradiction, and applied a 15% score penalty.</w:t>
+        <w:t>When tested with "Buy when RSI below 30 and MACD bearish crossover", the parser correctly generated two conditions RSI (BUY-direction) and MACD (SELL-direction due to bearish crossover). The Orchestrator detected an action-alignment mismatch (HIGH severity) between the RSI Agent (BUY alignment due to oversold conditions) and the MACD Agent (SELL alignment due to bearish momentum), issued a descriptive warning explaining the contradiction, and applied a 15% score penalty.</w:t>
       </w:r>
     </w:p>
     <w:p>
@@ -8672,7 +8810,19 @@
       </w:r>
       <w:proofErr w:type="spellEnd"/>
       <w:r>
-        <w:t xml:space="preserve"> mathematics and explainable trading strategy evaluation for the Gold (XAUUSD) market. By decomposing strategy analysis into five autonomous Specialist Agents — each independently scoring conditions through a uniform three-component model of rules, historical validation, and divergence detection — the system provides granular, per-indicator feedback that empowers traders to understand not merely </w:t>
+        <w:t xml:space="preserve"> mathematics and explainable trading strategy evaluation for the Gold (XAUUSD) market. By decomposing strategy analysis into five autonomous Specialist Agents</w:t>
+      </w:r>
+      <w:r>
+        <w:t>,</w:t>
+      </w:r>
+      <w:r>
+        <w:t xml:space="preserve"> each independently scoring conditions through a uniform three-component model of rules, historical validation, and divergence detection</w:t>
+      </w:r>
+      <w:r>
+        <w:t xml:space="preserve">, </w:t>
+      </w:r>
+      <w:r>
+        <w:t xml:space="preserve">the system provides granular, per-indicator feedback that empowers traders to understand not merely </w:t>
       </w:r>
       <w:r>
         <w:rPr>
@@ -11075,7 +11225,6 @@
   <w:style w:type="character" w:default="1" w:styleId="DefaultParagraphFont">
     <w:name w:val="Default Paragraph Font"/>
     <w:uiPriority w:val="1"/>
-    <w:semiHidden/>
     <w:unhideWhenUsed/>
   </w:style>
   <w:style w:type="table" w:default="1" w:styleId="TableNormal">

</xml_diff>